<commit_message>
Task 3: fix game for Jupyter, add three interactively played games; block C confirmed
- Game screens are drawn inside an ipywidgets Output widget, so button clicks
  update the board and circuit in Jupyter/VS Code (previously Colab only)
- Three games played by clicking in Jupyter Notebook, screenshots in results/gameplay
- Lecturer confirmed block C is a CNOT; report, Task 3 Word document and ZIP updated

Co-Authored-By: Claude Opus 5.5 <noreply@anthropic.com>
Claude-Session: https://claude.ai/code/session_01Cc7eGgMuZJii2jrx8znL2W
</commit_message>
<xml_diff>
--- a/Assignment_2_Quantum/Task_3_Quantum_TicTacToe/Task3_Report_Quantum_TicTacToe.docx
+++ b/Assignment_2_Quantum/Task_3_Quantum_TicTacToe/Task3_Report_Quantum_TicTacToe.docx
@@ -2348,6 +2348,124 @@
           </w:p>
         </w:tc>
       </w:tr>
+      <w:tr>
+        <w:tc>
+          <w:tcPr>
+            <w:tcW w:type="dxa" w:w="400"/>
+            <w:tcBorders>
+              <w:top w:val="single" w:color="A6A6A6" w:sz="4"/>
+              <w:left w:val="single" w:color="A6A6A6" w:sz="4"/>
+              <w:bottom w:val="single" w:color="A6A6A6" w:sz="4"/>
+              <w:right w:val="single" w:color="A6A6A6" w:sz="4"/>
+            </w:tcBorders>
+            <w:tcMar>
+              <w:top w:type="dxa" w:w="60"/>
+              <w:left w:type="dxa" w:w="90"/>
+              <w:bottom w:type="dxa" w:w="60"/>
+              <w:right w:type="dxa" w:w="90"/>
+            </w:tcMar>
+          </w:tcPr>
+          <w:p>
+            <w:pPr>
+              <w:spacing w:after="0" w:line="252"/>
+            </w:pPr>
+            <w:r>
+              <w:rPr>
+                <w:sz w:val="18"/>
+                <w:szCs w:val="18"/>
+              </w:rPr>
+              <w:t xml:space="preserve">9</w:t>
+            </w:r>
+          </w:p>
+        </w:tc>
+        <w:tc>
+          <w:tcPr>
+            <w:tcW w:type="dxa" w:w="1900"/>
+            <w:tcBorders>
+              <w:top w:val="single" w:color="A6A6A6" w:sz="4"/>
+              <w:left w:val="single" w:color="A6A6A6" w:sz="4"/>
+              <w:bottom w:val="single" w:color="A6A6A6" w:sz="4"/>
+              <w:right w:val="single" w:color="A6A6A6" w:sz="4"/>
+            </w:tcBorders>
+            <w:tcMar>
+              <w:top w:type="dxa" w:w="60"/>
+              <w:left w:type="dxa" w:w="90"/>
+              <w:bottom w:type="dxa" w:w="60"/>
+              <w:right w:type="dxa" w:w="90"/>
+            </w:tcMar>
+          </w:tcPr>
+          <w:p>
+            <w:pPr>
+              <w:spacing w:after="0" w:line="252"/>
+            </w:pPr>
+            <w:r>
+              <w:rPr>
+                <w:sz w:val="18"/>
+                <w:szCs w:val="18"/>
+              </w:rPr>
+              <w:t xml:space="preserve">screen updates after a click</w:t>
+            </w:r>
+          </w:p>
+        </w:tc>
+        <w:tc>
+          <w:tcPr>
+            <w:tcW w:type="dxa" w:w="3300"/>
+            <w:tcBorders>
+              <w:top w:val="single" w:color="A6A6A6" w:sz="4"/>
+              <w:left w:val="single" w:color="A6A6A6" w:sz="4"/>
+              <w:bottom w:val="single" w:color="A6A6A6" w:sz="4"/>
+              <w:right w:val="single" w:color="A6A6A6" w:sz="4"/>
+            </w:tcBorders>
+            <w:tcMar>
+              <w:top w:type="dxa" w:w="60"/>
+              <w:left w:type="dxa" w:w="90"/>
+              <w:bottom w:type="dxa" w:w="60"/>
+              <w:right w:type="dxa" w:w="90"/>
+            </w:tcMar>
+          </w:tcPr>
+          <w:p>
+            <w:pPr>
+              <w:spacing w:after="0" w:line="252"/>
+            </w:pPr>
+            <w:r>
+              <w:rPr>
+                <w:sz w:val="18"/>
+                <w:szCs w:val="18"/>
+              </w:rPr>
+              <w:t xml:space="preserve">callback output only shown in Colab; in Jupyter clicks seemed to do nothing</w:t>
+            </w:r>
+          </w:p>
+        </w:tc>
+        <w:tc>
+          <w:tcPr>
+            <w:tcW w:type="dxa" w:w="3426"/>
+            <w:tcBorders>
+              <w:top w:val="single" w:color="A6A6A6" w:sz="4"/>
+              <w:left w:val="single" w:color="A6A6A6" w:sz="4"/>
+              <w:bottom w:val="single" w:color="A6A6A6" w:sz="4"/>
+              <w:right w:val="single" w:color="A6A6A6" w:sz="4"/>
+            </w:tcBorders>
+            <w:tcMar>
+              <w:top w:type="dxa" w:w="60"/>
+              <w:left w:type="dxa" w:w="90"/>
+              <w:bottom w:type="dxa" w:w="60"/>
+              <w:right w:type="dxa" w:w="90"/>
+            </w:tcMar>
+          </w:tcPr>
+          <w:p>
+            <w:pPr>
+              <w:spacing w:after="0" w:line="252"/>
+            </w:pPr>
+            <w:r>
+              <w:rPr>
+                <w:sz w:val="18"/>
+                <w:szCs w:val="18"/>
+              </w:rPr>
+              <w:t xml:space="preserve">draw every screen inside an ipywidgets Output widget</w:t>
+            </w:r>
+          </w:p>
+        </w:tc>
+      </w:tr>
     </w:tbl>
     <w:p>
       <w:pPr>
@@ -4240,7 +4358,7 @@
         <w:pStyle w:val="Heading2"/>
       </w:pPr>
       <w:r>
-        <w:t xml:space="preserve">1.8 Can the game circuit run on Quokka?</w:t>
+        <w:t xml:space="preserve">1.8 Did we also play the game by clicking the buttons?</w:t>
       </w:r>
     </w:p>
     <w:p>
@@ -4249,26 +4367,27 @@
         <w:jc w:val="both"/>
       </w:pPr>
       <w:r>
-        <w:t xml:space="preserve">Yes. The notebook removes the </w:t>
-      </w:r>
-      <w:r>
-        <w:rPr>
-          <w:rFonts w:ascii="Consolas" w:cs="Consolas" w:eastAsia="Consolas" w:hAnsi="Consolas"/>
-          <w:sz w:val="19"/>
-          <w:szCs w:val="19"/>
-        </w:rPr>
-        <w:t xml:space="preserve">reset</w:t>
-      </w:r>
-      <w:r>
-        <w:t xml:space="preserve"> instructions (qubits already start at |0⟩), translates the Game 2 circuit to H, RY, X and CX gates, exports it to QASM and sends it with 1000 shots. With the labelled local fallback, the per-tile chances were 0.87, 0.50, 0.13, 0.51, 0.86, 0.50, 0.14, 0.53 and 0.87, the same pattern as Figure 3. This links the game back to the device used in Tasks 1 and 2.</w:t>
-      </w:r>
-    </w:p>
-    <w:p>
-      <w:pPr>
-        <w:pStyle w:val="Heading2"/>
-      </w:pPr>
-      <w:r>
-        <w:t xml:space="preserve">1.9 Which quantum gates does the game use? (Gate section)</w:t>
+        <w:t xml:space="preserve">Yes. To check that the completed game really works for a player, we opened the notebook in </w:t>
+      </w:r>
+      <w:r>
+        <w:rPr>
+          <w:b/>
+          <w:bCs/>
+        </w:rPr>
+        <w:t xml:space="preserve">Jupyter Notebook 7</w:t>
+      </w:r>
+      <w:r>
+        <w:t xml:space="preserve"> (the environment used in the lectures), ran it, and played three games by clicking the move and tile buttons. Each </w:t>
+      </w:r>
+      <w:r>
+        <w:rPr>
+          <w:b/>
+          <w:bCs/>
+        </w:rPr>
+        <w:t xml:space="preserve">Measure</w:t>
+      </w:r>
+      <w:r>
+        <w:t xml:space="preserve"> click runs the game circuit once, so every result is a genuine single random outcome.</w:t>
       </w:r>
     </w:p>
     <w:p>
@@ -4285,6 +4404,771 @@
           <w:szCs w:val="20"/>
         </w:rPr>
         <w:t xml:space="preserve">Table 3. </w:t>
+      </w:r>
+      <w:r>
+        <w:rPr>
+          <w:i/>
+          <w:iCs/>
+          <w:sz w:val="20"/>
+          <w:szCs w:val="20"/>
+        </w:rPr>
+        <w:t xml:space="preserve">Three games played interactively in Jupyter Notebook (31 October 2026)</w:t>
+      </w:r>
+    </w:p>
+    <w:tbl>
+      <w:tblPr>
+        <w:tblW w:type="dxa" w:w="9026"/>
+        <w:tblBorders>
+          <w:top w:val="single" w:color="auto" w:sz="4"/>
+          <w:left w:val="single" w:color="auto" w:sz="4"/>
+          <w:bottom w:val="single" w:color="auto" w:sz="4"/>
+          <w:right w:val="single" w:color="auto" w:sz="4"/>
+          <w:insideH w:val="single" w:color="auto" w:sz="4"/>
+          <w:insideV w:val="single" w:color="auto" w:sz="4"/>
+        </w:tblBorders>
+      </w:tblPr>
+      <w:tblGrid>
+        <w:gridCol w:w="900"/>
+        <w:gridCol w:w="3000"/>
+        <w:gridCol w:w="2800"/>
+        <w:gridCol w:w="2326"/>
+      </w:tblGrid>
+      <w:tr>
+        <w:trPr>
+          <w:tblHeader/>
+        </w:trPr>
+        <w:tc>
+          <w:tcPr>
+            <w:tcW w:type="dxa" w:w="900"/>
+            <w:tcBorders>
+              <w:top w:val="single" w:color="A6A6A6" w:sz="4"/>
+              <w:left w:val="single" w:color="A6A6A6" w:sz="4"/>
+              <w:bottom w:val="single" w:color="A6A6A6" w:sz="4"/>
+              <w:right w:val="single" w:color="A6A6A6" w:sz="4"/>
+            </w:tcBorders>
+            <w:shd w:fill="1F4E79" w:color="auto" w:val="clear"/>
+            <w:tcMar>
+              <w:top w:type="dxa" w:w="60"/>
+              <w:left w:type="dxa" w:w="90"/>
+              <w:bottom w:type="dxa" w:w="60"/>
+              <w:right w:type="dxa" w:w="90"/>
+            </w:tcMar>
+          </w:tcPr>
+          <w:p>
+            <w:pPr>
+              <w:spacing w:after="0" w:line="252"/>
+            </w:pPr>
+            <w:r>
+              <w:rPr>
+                <w:b/>
+                <w:bCs/>
+                <w:color w:val="FFFFFF"/>
+                <w:sz w:val="18"/>
+                <w:szCs w:val="18"/>
+              </w:rPr>
+              <w:t xml:space="preserve">Game</w:t>
+            </w:r>
+          </w:p>
+        </w:tc>
+        <w:tc>
+          <w:tcPr>
+            <w:tcW w:type="dxa" w:w="3000"/>
+            <w:tcBorders>
+              <w:top w:val="single" w:color="A6A6A6" w:sz="4"/>
+              <w:left w:val="single" w:color="A6A6A6" w:sz="4"/>
+              <w:bottom w:val="single" w:color="A6A6A6" w:sz="4"/>
+              <w:right w:val="single" w:color="A6A6A6" w:sz="4"/>
+            </w:tcBorders>
+            <w:shd w:fill="1F4E79" w:color="auto" w:val="clear"/>
+            <w:tcMar>
+              <w:top w:type="dxa" w:w="60"/>
+              <w:left w:type="dxa" w:w="90"/>
+              <w:bottom w:type="dxa" w:w="60"/>
+              <w:right w:type="dxa" w:w="90"/>
+            </w:tcMar>
+          </w:tcPr>
+          <w:p>
+            <w:pPr>
+              <w:spacing w:after="0" w:line="252"/>
+            </w:pPr>
+            <w:r>
+              <w:rPr>
+                <w:b/>
+                <w:bCs/>
+                <w:color w:val="FFFFFF"/>
+                <w:sz w:val="18"/>
+                <w:szCs w:val="18"/>
+              </w:rPr>
+              <w:t xml:space="preserve">Buttons clicked</w:t>
+            </w:r>
+          </w:p>
+        </w:tc>
+        <w:tc>
+          <w:tcPr>
+            <w:tcW w:type="dxa" w:w="2800"/>
+            <w:tcBorders>
+              <w:top w:val="single" w:color="A6A6A6" w:sz="4"/>
+              <w:left w:val="single" w:color="A6A6A6" w:sz="4"/>
+              <w:bottom w:val="single" w:color="A6A6A6" w:sz="4"/>
+              <w:right w:val="single" w:color="A6A6A6" w:sz="4"/>
+            </w:tcBorders>
+            <w:shd w:fill="1F4E79" w:color="auto" w:val="clear"/>
+            <w:tcMar>
+              <w:top w:type="dxa" w:w="60"/>
+              <w:left w:type="dxa" w:w="90"/>
+              <w:bottom w:type="dxa" w:w="60"/>
+              <w:right w:type="dxa" w:w="90"/>
+            </w:tcMar>
+          </w:tcPr>
+          <w:p>
+            <w:pPr>
+              <w:spacing w:after="0" w:line="252"/>
+            </w:pPr>
+            <w:r>
+              <w:rPr>
+                <w:b/>
+                <w:bCs/>
+                <w:color w:val="FFFFFF"/>
+                <w:sz w:val="18"/>
+                <w:szCs w:val="18"/>
+              </w:rPr>
+              <w:t xml:space="preserve">Final board (rows)</w:t>
+            </w:r>
+          </w:p>
+        </w:tc>
+        <w:tc>
+          <w:tcPr>
+            <w:tcW w:type="dxa" w:w="2326"/>
+            <w:tcBorders>
+              <w:top w:val="single" w:color="A6A6A6" w:sz="4"/>
+              <w:left w:val="single" w:color="A6A6A6" w:sz="4"/>
+              <w:bottom w:val="single" w:color="A6A6A6" w:sz="4"/>
+              <w:right w:val="single" w:color="A6A6A6" w:sz="4"/>
+            </w:tcBorders>
+            <w:shd w:fill="1F4E79" w:color="auto" w:val="clear"/>
+            <w:tcMar>
+              <w:top w:type="dxa" w:w="60"/>
+              <w:left w:type="dxa" w:w="90"/>
+              <w:bottom w:type="dxa" w:w="60"/>
+              <w:right w:type="dxa" w:w="90"/>
+            </w:tcMar>
+          </w:tcPr>
+          <w:p>
+            <w:pPr>
+              <w:spacing w:after="0" w:line="252"/>
+            </w:pPr>
+            <w:r>
+              <w:rPr>
+                <w:b/>
+                <w:bCs/>
+                <w:color w:val="FFFFFF"/>
+                <w:sz w:val="18"/>
+                <w:szCs w:val="18"/>
+              </w:rPr>
+              <w:t xml:space="preserve">Result and what it shows</w:t>
+            </w:r>
+          </w:p>
+        </w:tc>
+      </w:tr>
+      <w:tr>
+        <w:tc>
+          <w:tcPr>
+            <w:tcW w:type="dxa" w:w="900"/>
+            <w:tcBorders>
+              <w:top w:val="single" w:color="A6A6A6" w:sz="4"/>
+              <w:left w:val="single" w:color="A6A6A6" w:sz="4"/>
+              <w:bottom w:val="single" w:color="A6A6A6" w:sz="4"/>
+              <w:right w:val="single" w:color="A6A6A6" w:sz="4"/>
+            </w:tcBorders>
+            <w:tcMar>
+              <w:top w:type="dxa" w:w="60"/>
+              <w:left w:type="dxa" w:w="90"/>
+              <w:bottom w:type="dxa" w:w="60"/>
+              <w:right w:type="dxa" w:w="90"/>
+            </w:tcMar>
+          </w:tcPr>
+          <w:p>
+            <w:pPr>
+              <w:spacing w:after="0" w:line="252"/>
+            </w:pPr>
+            <w:r>
+              <w:rPr>
+                <w:sz w:val="18"/>
+                <w:szCs w:val="18"/>
+              </w:rPr>
+              <w:t xml:space="preserve">A</w:t>
+            </w:r>
+          </w:p>
+        </w:tc>
+        <w:tc>
+          <w:tcPr>
+            <w:tcW w:type="dxa" w:w="3000"/>
+            <w:tcBorders>
+              <w:top w:val="single" w:color="A6A6A6" w:sz="4"/>
+              <w:left w:val="single" w:color="A6A6A6" w:sz="4"/>
+              <w:bottom w:val="single" w:color="A6A6A6" w:sz="4"/>
+              <w:right w:val="single" w:color="A6A6A6" w:sz="4"/>
+            </w:tcBorders>
+            <w:tcMar>
+              <w:top w:type="dxa" w:w="60"/>
+              <w:left w:type="dxa" w:w="90"/>
+              <w:bottom w:type="dxa" w:w="60"/>
+              <w:right w:type="dxa" w:w="90"/>
+            </w:tcMar>
+          </w:tcPr>
+          <w:p>
+            <w:pPr>
+              <w:spacing w:after="0" w:line="252"/>
+            </w:pPr>
+            <w:r>
+              <w:rPr>
+                <w:sz w:val="18"/>
+                <w:szCs w:val="18"/>
+              </w:rPr>
+              <w:t xml:space="preserve">X 4, X 4, O 0, O 8, Not 2</w:t>
+            </w:r>
+          </w:p>
+        </w:tc>
+        <w:tc>
+          <w:tcPr>
+            <w:tcW w:type="dxa" w:w="2800"/>
+            <w:tcBorders>
+              <w:top w:val="single" w:color="A6A6A6" w:sz="4"/>
+              <w:left w:val="single" w:color="A6A6A6" w:sz="4"/>
+              <w:bottom w:val="single" w:color="A6A6A6" w:sz="4"/>
+              <w:right w:val="single" w:color="A6A6A6" w:sz="4"/>
+            </w:tcBorders>
+            <w:tcMar>
+              <w:top w:type="dxa" w:w="60"/>
+              <w:left w:type="dxa" w:w="90"/>
+              <w:bottom w:type="dxa" w:w="60"/>
+              <w:right w:type="dxa" w:w="90"/>
+            </w:tcMar>
+          </w:tcPr>
+          <w:p>
+            <w:pPr>
+              <w:spacing w:after="0" w:line="252"/>
+            </w:pPr>
+            <w:r>
+              <w:rPr>
+                <w:sz w:val="18"/>
+                <w:szCs w:val="18"/>
+              </w:rPr>
+              <w:t xml:space="preserve">X O O / O X X / O X O</w:t>
+            </w:r>
+          </w:p>
+        </w:tc>
+        <w:tc>
+          <w:tcPr>
+            <w:tcW w:type="dxa" w:w="2326"/>
+            <w:tcBorders>
+              <w:top w:val="single" w:color="A6A6A6" w:sz="4"/>
+              <w:left w:val="single" w:color="A6A6A6" w:sz="4"/>
+              <w:bottom w:val="single" w:color="A6A6A6" w:sz="4"/>
+              <w:right w:val="single" w:color="A6A6A6" w:sz="4"/>
+            </w:tcBorders>
+            <w:tcMar>
+              <w:top w:type="dxa" w:w="60"/>
+              <w:left w:type="dxa" w:w="90"/>
+              <w:bottom w:type="dxa" w:w="60"/>
+              <w:right w:type="dxa" w:w="90"/>
+            </w:tcMar>
+          </w:tcPr>
+          <w:p>
+            <w:pPr>
+              <w:spacing w:after="0" w:line="252"/>
+            </w:pPr>
+            <w:r>
+              <w:rPr>
+                <w:sz w:val="18"/>
+                <w:szCs w:val="18"/>
+              </w:rPr>
+              <w:t xml:space="preserve">Draw 0–0. Tile 4 (two X moves) was certain X. Tile 0 had one O move (85% O) yet became X: a 15% outcome happened.</w:t>
+            </w:r>
+          </w:p>
+        </w:tc>
+      </w:tr>
+      <w:tr>
+        <w:tc>
+          <w:tcPr>
+            <w:tcW w:type="dxa" w:w="900"/>
+            <w:tcBorders>
+              <w:top w:val="single" w:color="A6A6A6" w:sz="4"/>
+              <w:left w:val="single" w:color="A6A6A6" w:sz="4"/>
+              <w:bottom w:val="single" w:color="A6A6A6" w:sz="4"/>
+              <w:right w:val="single" w:color="A6A6A6" w:sz="4"/>
+            </w:tcBorders>
+            <w:shd w:fill="EEF3F8" w:color="auto" w:val="clear"/>
+            <w:tcMar>
+              <w:top w:type="dxa" w:w="60"/>
+              <w:left w:type="dxa" w:w="90"/>
+              <w:bottom w:type="dxa" w:w="60"/>
+              <w:right w:type="dxa" w:w="90"/>
+            </w:tcMar>
+          </w:tcPr>
+          <w:p>
+            <w:pPr>
+              <w:spacing w:after="0" w:line="252"/>
+            </w:pPr>
+            <w:r>
+              <w:rPr>
+                <w:sz w:val="18"/>
+                <w:szCs w:val="18"/>
+              </w:rPr>
+              <w:t xml:space="preserve">B</w:t>
+            </w:r>
+          </w:p>
+        </w:tc>
+        <w:tc>
+          <w:tcPr>
+            <w:tcW w:type="dxa" w:w="3000"/>
+            <w:tcBorders>
+              <w:top w:val="single" w:color="A6A6A6" w:sz="4"/>
+              <w:left w:val="single" w:color="A6A6A6" w:sz="4"/>
+              <w:bottom w:val="single" w:color="A6A6A6" w:sz="4"/>
+              <w:right w:val="single" w:color="A6A6A6" w:sz="4"/>
+            </w:tcBorders>
+            <w:shd w:fill="EEF3F8" w:color="auto" w:val="clear"/>
+            <w:tcMar>
+              <w:top w:type="dxa" w:w="60"/>
+              <w:left w:type="dxa" w:w="90"/>
+              <w:bottom w:type="dxa" w:w="60"/>
+              <w:right w:type="dxa" w:w="90"/>
+            </w:tcMar>
+          </w:tcPr>
+          <w:p>
+            <w:pPr>
+              <w:spacing w:after="0" w:line="252"/>
+            </w:pPr>
+            <w:r>
+              <w:rPr>
+                <w:sz w:val="18"/>
+                <w:szCs w:val="18"/>
+              </w:rPr>
+              <w:t xml:space="preserve">X 0, X 4, X 8, O 2, O 6</w:t>
+            </w:r>
+          </w:p>
+        </w:tc>
+        <w:tc>
+          <w:tcPr>
+            <w:tcW w:type="dxa" w:w="2800"/>
+            <w:tcBorders>
+              <w:top w:val="single" w:color="A6A6A6" w:sz="4"/>
+              <w:left w:val="single" w:color="A6A6A6" w:sz="4"/>
+              <w:bottom w:val="single" w:color="A6A6A6" w:sz="4"/>
+              <w:right w:val="single" w:color="A6A6A6" w:sz="4"/>
+            </w:tcBorders>
+            <w:shd w:fill="EEF3F8" w:color="auto" w:val="clear"/>
+            <w:tcMar>
+              <w:top w:type="dxa" w:w="60"/>
+              <w:left w:type="dxa" w:w="90"/>
+              <w:bottom w:type="dxa" w:w="60"/>
+              <w:right w:type="dxa" w:w="90"/>
+            </w:tcMar>
+          </w:tcPr>
+          <w:p>
+            <w:pPr>
+              <w:spacing w:after="0" w:line="252"/>
+            </w:pPr>
+            <w:r>
+              <w:rPr>
+                <w:sz w:val="18"/>
+                <w:szCs w:val="18"/>
+              </w:rPr>
+              <w:t xml:space="preserve">X O O / X X O / O O X</w:t>
+            </w:r>
+          </w:p>
+        </w:tc>
+        <w:tc>
+          <w:tcPr>
+            <w:tcW w:type="dxa" w:w="2326"/>
+            <w:tcBorders>
+              <w:top w:val="single" w:color="A6A6A6" w:sz="4"/>
+              <w:left w:val="single" w:color="A6A6A6" w:sz="4"/>
+              <w:bottom w:val="single" w:color="A6A6A6" w:sz="4"/>
+              <w:right w:val="single" w:color="A6A6A6" w:sz="4"/>
+            </w:tcBorders>
+            <w:shd w:fill="EEF3F8" w:color="auto" w:val="clear"/>
+            <w:tcMar>
+              <w:top w:type="dxa" w:w="60"/>
+              <w:left w:type="dxa" w:w="90"/>
+              <w:bottom w:type="dxa" w:w="60"/>
+              <w:right w:type="dxa" w:w="90"/>
+            </w:tcMar>
+          </w:tcPr>
+          <w:p>
+            <w:pPr>
+              <w:spacing w:after="0" w:line="252"/>
+            </w:pPr>
+            <w:r>
+              <w:rPr>
+                <w:sz w:val="18"/>
+                <w:szCs w:val="18"/>
+              </w:rPr>
+              <w:t xml:space="preserve">X wins the main diagonal 0–4–8, the three tiles nudged toward X.</w:t>
+            </w:r>
+          </w:p>
+        </w:tc>
+      </w:tr>
+      <w:tr>
+        <w:tc>
+          <w:tcPr>
+            <w:tcW w:type="dxa" w:w="900"/>
+            <w:tcBorders>
+              <w:top w:val="single" w:color="A6A6A6" w:sz="4"/>
+              <w:left w:val="single" w:color="A6A6A6" w:sz="4"/>
+              <w:bottom w:val="single" w:color="A6A6A6" w:sz="4"/>
+              <w:right w:val="single" w:color="A6A6A6" w:sz="4"/>
+            </w:tcBorders>
+            <w:tcMar>
+              <w:top w:type="dxa" w:w="60"/>
+              <w:left w:type="dxa" w:w="90"/>
+              <w:bottom w:type="dxa" w:w="60"/>
+              <w:right w:type="dxa" w:w="90"/>
+            </w:tcMar>
+          </w:tcPr>
+          <w:p>
+            <w:pPr>
+              <w:spacing w:after="0" w:line="252"/>
+            </w:pPr>
+            <w:r>
+              <w:rPr>
+                <w:sz w:val="18"/>
+                <w:szCs w:val="18"/>
+              </w:rPr>
+              <w:t xml:space="preserve">C</w:t>
+            </w:r>
+          </w:p>
+        </w:tc>
+        <w:tc>
+          <w:tcPr>
+            <w:tcW w:type="dxa" w:w="3000"/>
+            <w:tcBorders>
+              <w:top w:val="single" w:color="A6A6A6" w:sz="4"/>
+              <w:left w:val="single" w:color="A6A6A6" w:sz="4"/>
+              <w:bottom w:val="single" w:color="A6A6A6" w:sz="4"/>
+              <w:right w:val="single" w:color="A6A6A6" w:sz="4"/>
+            </w:tcBorders>
+            <w:tcMar>
+              <w:top w:type="dxa" w:w="60"/>
+              <w:left w:type="dxa" w:w="90"/>
+              <w:bottom w:type="dxa" w:w="60"/>
+              <w:right w:type="dxa" w:w="90"/>
+            </w:tcMar>
+          </w:tcPr>
+          <w:p>
+            <w:pPr>
+              <w:spacing w:after="0" w:line="252"/>
+            </w:pPr>
+            <w:r>
+              <w:rPr>
+                <w:sz w:val="18"/>
+                <w:szCs w:val="18"/>
+              </w:rPr>
+              <w:t xml:space="preserve">O 4, O 4, X 1, Not 4, SWAP 0↔8</w:t>
+            </w:r>
+          </w:p>
+        </w:tc>
+        <w:tc>
+          <w:tcPr>
+            <w:tcW w:type="dxa" w:w="2800"/>
+            <w:tcBorders>
+              <w:top w:val="single" w:color="A6A6A6" w:sz="4"/>
+              <w:left w:val="single" w:color="A6A6A6" w:sz="4"/>
+              <w:bottom w:val="single" w:color="A6A6A6" w:sz="4"/>
+              <w:right w:val="single" w:color="A6A6A6" w:sz="4"/>
+            </w:tcBorders>
+            <w:tcMar>
+              <w:top w:type="dxa" w:w="60"/>
+              <w:left w:type="dxa" w:w="90"/>
+              <w:bottom w:type="dxa" w:w="60"/>
+              <w:right w:type="dxa" w:w="90"/>
+            </w:tcMar>
+          </w:tcPr>
+          <w:p>
+            <w:pPr>
+              <w:spacing w:after="0" w:line="252"/>
+            </w:pPr>
+            <w:r>
+              <w:rPr>
+                <w:sz w:val="18"/>
+                <w:szCs w:val="18"/>
+              </w:rPr>
+              <w:t xml:space="preserve">X X X / X X O / O O X</w:t>
+            </w:r>
+          </w:p>
+        </w:tc>
+        <w:tc>
+          <w:tcPr>
+            <w:tcW w:type="dxa" w:w="2326"/>
+            <w:tcBorders>
+              <w:top w:val="single" w:color="A6A6A6" w:sz="4"/>
+              <w:left w:val="single" w:color="A6A6A6" w:sz="4"/>
+              <w:bottom w:val="single" w:color="A6A6A6" w:sz="4"/>
+              <w:right w:val="single" w:color="A6A6A6" w:sz="4"/>
+            </w:tcBorders>
+            <w:tcMar>
+              <w:top w:type="dxa" w:w="60"/>
+              <w:left w:type="dxa" w:w="90"/>
+              <w:bottom w:type="dxa" w:w="60"/>
+              <w:right w:type="dxa" w:w="90"/>
+            </w:tcMar>
+          </w:tcPr>
+          <w:p>
+            <w:pPr>
+              <w:spacing w:after="0" w:line="252"/>
+            </w:pPr>
+            <w:r>
+              <w:rPr>
+                <w:sz w:val="18"/>
+                <w:szCs w:val="18"/>
+              </w:rPr>
+              <w:t xml:space="preserve">X wins 2 lines. Two O moves made tile 4 certain O, then NOT made it certain X, exactly as the theory predicts.</w:t>
+            </w:r>
+          </w:p>
+        </w:tc>
+      </w:tr>
+    </w:tbl>
+    <w:p>
+      <w:pPr>
+        <w:spacing w:after="100"/>
+      </w:pPr>
+    </w:p>
+    <w:p>
+      <w:pPr>
+        <w:keepNext/>
+        <w:spacing w:after="60" w:before="120"/>
+        <w:jc w:val="center"/>
+      </w:pPr>
+      <w:r>
+        <w:drawing>
+          <wp:inline distT="0" distB="0" distL="0" distR="0">
+            <wp:extent cx="4953000" cy="4362450"/>
+            <wp:effectExtent t="0" r="0" b="0" l="0"/>
+            <wp:docPr id="5" name="playC1" descr="Game C in Jupyter before Measure: the board shows the move history, and the circuit shows RY, X and the SWAP between tiles 0 and 8" title="Game C in Jupyter before Measure: the board shows the move history, and the circuit shows RY, X and the SWAP between tiles 0 and 8"/>
+            <wp:cNvGraphicFramePr>
+              <a:graphicFrameLocks xmlns:a="http://schemas.openxmlformats.org/drawingml/2006/main" noChangeAspect="1"/>
+            </wp:cNvGraphicFramePr>
+            <a:graphic xmlns:a="http://schemas.openxmlformats.org/drawingml/2006/main">
+              <a:graphicData uri="http://schemas.openxmlformats.org/drawingml/2006/picture">
+                <pic:pic xmlns:pic="http://schemas.openxmlformats.org/drawingml/2006/picture">
+                  <pic:nvPicPr>
+                    <pic:cNvPr id="0" name="" descr=""/>
+                    <pic:cNvPicPr>
+                      <a:picLocks noChangeAspect="1" noChangeArrowheads="1"/>
+                    </pic:cNvPicPr>
+                  </pic:nvPicPr>
+                  <pic:blipFill>
+                    <a:blip r:embed="rId13" cstate="none"/>
+                    <a:srcRect/>
+                    <a:stretch>
+                      <a:fillRect/>
+                    </a:stretch>
+                  </pic:blipFill>
+                  <pic:spPr bwMode="auto">
+                    <a:xfrm>
+                      <a:off x="0" y="0"/>
+                      <a:ext cx="4953000" cy="4362450"/>
+                    </a:xfrm>
+                    <a:prstGeom prst="rect">
+                      <a:avLst/>
+                    </a:prstGeom>
+                  </pic:spPr>
+                </pic:pic>
+              </a:graphicData>
+            </a:graphic>
+          </wp:inline>
+        </w:drawing>
+      </w:r>
+    </w:p>
+    <w:p>
+      <w:pPr>
+        <w:spacing w:after="200"/>
+        <w:jc w:val="center"/>
+      </w:pPr>
+      <w:r>
+        <w:rPr>
+          <w:b/>
+          <w:bCs/>
+          <w:color w:val="1F4E79"/>
+          <w:sz w:val="20"/>
+          <w:szCs w:val="20"/>
+        </w:rPr>
+        <w:t xml:space="preserve">Figure 5. </w:t>
+      </w:r>
+      <w:r>
+        <w:rPr>
+          <w:i/>
+          <w:iCs/>
+          <w:sz w:val="20"/>
+          <w:szCs w:val="20"/>
+        </w:rPr>
+        <w:t xml:space="preserve">Game C in Jupyter before Measure: the board shows the move history, and the circuit shows RY, X and the SWAP between tiles 0 and 8</w:t>
+      </w:r>
+    </w:p>
+    <w:p>
+      <w:pPr>
+        <w:keepNext/>
+        <w:spacing w:after="60" w:before="120"/>
+        <w:jc w:val="center"/>
+      </w:pPr>
+      <w:r>
+        <w:drawing>
+          <wp:inline distT="0" distB="0" distL="0" distR="0">
+            <wp:extent cx="4953000" cy="4105275"/>
+            <wp:effectExtent t="0" r="0" b="0" l="0"/>
+            <wp:docPr id="6" name="playC2" descr="Game C after Measure: one shot decided every tile; X wins 2 lines" title="Game C after Measure: one shot decided every tile; X wins 2 lines"/>
+            <wp:cNvGraphicFramePr>
+              <a:graphicFrameLocks xmlns:a="http://schemas.openxmlformats.org/drawingml/2006/main" noChangeAspect="1"/>
+            </wp:cNvGraphicFramePr>
+            <a:graphic xmlns:a="http://schemas.openxmlformats.org/drawingml/2006/main">
+              <a:graphicData uri="http://schemas.openxmlformats.org/drawingml/2006/picture">
+                <pic:pic xmlns:pic="http://schemas.openxmlformats.org/drawingml/2006/picture">
+                  <pic:nvPicPr>
+                    <pic:cNvPr id="0" name="" descr=""/>
+                    <pic:cNvPicPr>
+                      <a:picLocks noChangeAspect="1" noChangeArrowheads="1"/>
+                    </pic:cNvPicPr>
+                  </pic:nvPicPr>
+                  <pic:blipFill>
+                    <a:blip r:embed="rId14" cstate="none"/>
+                    <a:srcRect/>
+                    <a:stretch>
+                      <a:fillRect/>
+                    </a:stretch>
+                  </pic:blipFill>
+                  <pic:spPr bwMode="auto">
+                    <a:xfrm>
+                      <a:off x="0" y="0"/>
+                      <a:ext cx="4953000" cy="4105275"/>
+                    </a:xfrm>
+                    <a:prstGeom prst="rect">
+                      <a:avLst/>
+                    </a:prstGeom>
+                  </pic:spPr>
+                </pic:pic>
+              </a:graphicData>
+            </a:graphic>
+          </wp:inline>
+        </w:drawing>
+      </w:r>
+    </w:p>
+    <w:p>
+      <w:pPr>
+        <w:spacing w:after="200"/>
+        <w:jc w:val="center"/>
+      </w:pPr>
+      <w:r>
+        <w:rPr>
+          <w:b/>
+          <w:bCs/>
+          <w:color w:val="1F4E79"/>
+          <w:sz w:val="20"/>
+          <w:szCs w:val="20"/>
+        </w:rPr>
+        <w:t xml:space="preserve">Figure 6. </w:t>
+      </w:r>
+      <w:r>
+        <w:rPr>
+          <w:i/>
+          <w:iCs/>
+          <w:sz w:val="20"/>
+          <w:szCs w:val="20"/>
+        </w:rPr>
+        <w:t xml:space="preserve">Game C after Measure: one shot decided every tile; X wins 2 lines</w:t>
+      </w:r>
+    </w:p>
+    <w:p>
+      <w:pPr>
+        <w:spacing w:after="140" w:line="288"/>
+        <w:jc w:val="both"/>
+      </w:pPr>
+      <w:r>
+        <w:t xml:space="preserve">Playing also exposed a </w:t>
+      </w:r>
+      <w:r>
+        <w:rPr>
+          <w:b/>
+          <w:bCs/>
+        </w:rPr>
+        <w:t xml:space="preserve">portability bug</w:t>
+      </w:r>
+      <w:r>
+        <w:t xml:space="preserve">. In the supplied code, every screen update after a click (board, circuit, score) is printed from inside the button's callback. Google Colab shows that output, but Jupyter Notebook and VS Code discard it, so clicks *appeared to do nothing*. We fixed this by drawing all game screens inside an </w:t>
+      </w:r>
+      <w:r>
+        <w:rPr>
+          <w:rFonts w:ascii="Consolas" w:cs="Consolas" w:eastAsia="Consolas" w:hAnsi="Consolas"/>
+          <w:sz w:val="19"/>
+          <w:szCs w:val="19"/>
+        </w:rPr>
+        <w:t xml:space="preserve">ipywidgets.Output</w:t>
+      </w:r>
+      <w:r>
+        <w:t xml:space="preserve"> widget (marked </w:t>
+      </w:r>
+      <w:r>
+        <w:rPr>
+          <w:rFonts w:ascii="Consolas" w:cs="Consolas" w:eastAsia="Consolas" w:hAnsi="Consolas"/>
+          <w:sz w:val="19"/>
+          <w:szCs w:val="19"/>
+        </w:rPr>
+        <w:t xml:space="preserve">[CHANGED]</w:t>
+      </w:r>
+      <w:r>
+        <w:t xml:space="preserve">), after which the game worked in all three environments.</w:t>
+      </w:r>
+    </w:p>
+    <w:p>
+      <w:pPr>
+        <w:pStyle w:val="Heading2"/>
+      </w:pPr>
+      <w:r>
+        <w:t xml:space="preserve">1.9 Can the game circuit run on Quokka?</w:t>
+      </w:r>
+    </w:p>
+    <w:p>
+      <w:pPr>
+        <w:spacing w:after="140" w:line="288"/>
+        <w:jc w:val="both"/>
+      </w:pPr>
+      <w:r>
+        <w:t xml:space="preserve">Yes. The notebook removes the </w:t>
+      </w:r>
+      <w:r>
+        <w:rPr>
+          <w:rFonts w:ascii="Consolas" w:cs="Consolas" w:eastAsia="Consolas" w:hAnsi="Consolas"/>
+          <w:sz w:val="19"/>
+          <w:szCs w:val="19"/>
+        </w:rPr>
+        <w:t xml:space="preserve">reset</w:t>
+      </w:r>
+      <w:r>
+        <w:t xml:space="preserve"> instructions (qubits already start at |0⟩), translates the Game 2 circuit to H, RY, X and CX gates, exports it to QASM and sends it with 1000 shots. With the labelled local fallback, the per-tile chances were 0.87, 0.50, 0.13, 0.51, 0.86, 0.50, 0.14, 0.53 and 0.87, the same pattern as Figure 3. This links the game back to the device used in Tasks 1 and 2.</w:t>
+      </w:r>
+    </w:p>
+    <w:p>
+      <w:pPr>
+        <w:pStyle w:val="Heading2"/>
+      </w:pPr>
+      <w:r>
+        <w:t xml:space="preserve">1.10 Which quantum gates does the game use? (Gate section)</w:t>
+      </w:r>
+    </w:p>
+    <w:p>
+      <w:pPr>
+        <w:keepNext/>
+        <w:spacing w:after="80" w:before="120"/>
+      </w:pPr>
+      <w:r>
+        <w:rPr>
+          <w:b/>
+          <w:bCs/>
+          <w:color w:val="1F4E79"/>
+          <w:sz w:val="20"/>
+          <w:szCs w:val="20"/>
+        </w:rPr>
+        <w:t xml:space="preserve">Table 4. </w:t>
       </w:r>
       <w:r>
         <w:rPr>
@@ -5300,7 +6184,7 @@
         <w:pStyle w:val="Heading2"/>
       </w:pPr>
       <w:r>
-        <w:t xml:space="preserve">1.10 How do these gates fit the wider theory of quantum logic gates?</w:t>
+        <w:t xml:space="preserve">1.11 How do these gates fit the wider theory of quantum logic gates?</w:t>
       </w:r>
     </w:p>
     <w:p>
@@ -5461,7 +6345,7 @@
         <w:pStyle w:val="Heading2"/>
       </w:pPr>
       <w:r>
-        <w:t xml:space="preserve">1.11 What are the strengths and limits of the program?</w:t>
+        <w:t xml:space="preserve">1.12 What are the strengths and limits of the program?</w:t>
       </w:r>
     </w:p>
     <w:p>

</xml_diff>